<commit_message>
aulas quinta, sexta, resumo e revisao
</commit_message>
<xml_diff>
--- a/3semestre/designsoftware/TDE1.docx
+++ b/3semestre/designsoftware/TDE1.docx
@@ -719,35 +719,35 @@
         <w:rPr>
           <w:rFonts w:ascii="Arial" w:hAnsi="Arial" w:cs="Arial"/>
         </w:rPr>
-        <w:t>Booch</w:t>
+        <w:t>Object</w:t>
       </w:r>
       <w:proofErr w:type="spellEnd"/>
       <w:r>
         <w:rPr>
           <w:rFonts w:ascii="Arial" w:hAnsi="Arial" w:cs="Arial"/>
         </w:rPr>
-        <w:t xml:space="preserve">, G., </w:t>
+        <w:t xml:space="preserve"> Management </w:t>
       </w:r>
       <w:proofErr w:type="spellStart"/>
       <w:r>
         <w:rPr>
           <w:rFonts w:ascii="Arial" w:hAnsi="Arial" w:cs="Arial"/>
         </w:rPr>
-        <w:t>Rumbaugh</w:t>
+        <w:t>Group</w:t>
       </w:r>
       <w:proofErr w:type="spellEnd"/>
       <w:r>
         <w:rPr>
           <w:rFonts w:ascii="Arial" w:hAnsi="Arial" w:cs="Arial"/>
         </w:rPr>
-        <w:t xml:space="preserve">, J., &amp; Jacobson, I. (2005). The </w:t>
+        <w:t xml:space="preserve">. (2022). UML </w:t>
       </w:r>
       <w:proofErr w:type="spellStart"/>
       <w:r>
         <w:rPr>
           <w:rFonts w:ascii="Arial" w:hAnsi="Arial" w:cs="Arial"/>
         </w:rPr>
-        <w:t>Unified</w:t>
+        <w:t>Specification</w:t>
       </w:r>
       <w:proofErr w:type="spellEnd"/>
       <w:r>
@@ -761,226 +761,14 @@
         <w:rPr>
           <w:rFonts w:ascii="Arial" w:hAnsi="Arial" w:cs="Arial"/>
         </w:rPr>
-        <w:t>Modeling</w:t>
+        <w:t>Version</w:t>
       </w:r>
       <w:proofErr w:type="spellEnd"/>
       <w:r>
         <w:rPr>
           <w:rFonts w:ascii="Arial" w:hAnsi="Arial" w:cs="Arial"/>
         </w:rPr>
-        <w:t xml:space="preserve"> </w:t>
-      </w:r>
-      <w:proofErr w:type="spellStart"/>
-      <w:r>
-        <w:rPr>
-          <w:rFonts w:ascii="Arial" w:hAnsi="Arial" w:cs="Arial"/>
-        </w:rPr>
-        <w:t>Language</w:t>
-      </w:r>
-      <w:proofErr w:type="spellEnd"/>
-      <w:r>
-        <w:rPr>
-          <w:rFonts w:ascii="Arial" w:hAnsi="Arial" w:cs="Arial"/>
-        </w:rPr>
-        <w:t xml:space="preserve"> </w:t>
-      </w:r>
-      <w:proofErr w:type="spellStart"/>
-      <w:r>
-        <w:rPr>
-          <w:rFonts w:ascii="Arial" w:hAnsi="Arial" w:cs="Arial"/>
-        </w:rPr>
-        <w:t>User</w:t>
-      </w:r>
-      <w:proofErr w:type="spellEnd"/>
-      <w:r>
-        <w:rPr>
-          <w:rFonts w:ascii="Arial" w:hAnsi="Arial" w:cs="Arial"/>
-        </w:rPr>
-        <w:t xml:space="preserve"> </w:t>
-      </w:r>
-      <w:proofErr w:type="spellStart"/>
-      <w:r>
-        <w:rPr>
-          <w:rFonts w:ascii="Arial" w:hAnsi="Arial" w:cs="Arial"/>
-        </w:rPr>
-        <w:t>Guide</w:t>
-      </w:r>
-      <w:proofErr w:type="spellEnd"/>
-      <w:r>
-        <w:rPr>
-          <w:rFonts w:ascii="Arial" w:hAnsi="Arial" w:cs="Arial"/>
-        </w:rPr>
-        <w:t>. Addison-Wesley.</w:t>
-      </w:r>
-    </w:p>
-    <w:p>
-      <w:pPr>
-        <w:pStyle w:val="NormalWeb"/>
-        <w:rPr>
-          <w:rFonts w:ascii="Arial" w:hAnsi="Arial" w:cs="Arial"/>
-        </w:rPr>
-      </w:pPr>
-      <w:proofErr w:type="spellStart"/>
-      <w:r>
-        <w:rPr>
-          <w:rFonts w:ascii="Arial" w:hAnsi="Arial" w:cs="Arial"/>
-        </w:rPr>
-        <w:t>Object</w:t>
-      </w:r>
-      <w:proofErr w:type="spellEnd"/>
-      <w:r>
-        <w:rPr>
-          <w:rFonts w:ascii="Arial" w:hAnsi="Arial" w:cs="Arial"/>
-        </w:rPr>
-        <w:t xml:space="preserve"> Management </w:t>
-      </w:r>
-      <w:proofErr w:type="spellStart"/>
-      <w:r>
-        <w:rPr>
-          <w:rFonts w:ascii="Arial" w:hAnsi="Arial" w:cs="Arial"/>
-        </w:rPr>
-        <w:t>Group</w:t>
-      </w:r>
-      <w:proofErr w:type="spellEnd"/>
-      <w:r>
-        <w:rPr>
-          <w:rFonts w:ascii="Arial" w:hAnsi="Arial" w:cs="Arial"/>
-        </w:rPr>
-        <w:t xml:space="preserve">. (2022). UML </w:t>
-      </w:r>
-      <w:proofErr w:type="spellStart"/>
-      <w:r>
-        <w:rPr>
-          <w:rFonts w:ascii="Arial" w:hAnsi="Arial" w:cs="Arial"/>
-        </w:rPr>
-        <w:t>Specification</w:t>
-      </w:r>
-      <w:proofErr w:type="spellEnd"/>
-      <w:r>
-        <w:rPr>
-          <w:rFonts w:ascii="Arial" w:hAnsi="Arial" w:cs="Arial"/>
-        </w:rPr>
-        <w:t xml:space="preserve"> </w:t>
-      </w:r>
-      <w:proofErr w:type="spellStart"/>
-      <w:r>
-        <w:rPr>
-          <w:rFonts w:ascii="Arial" w:hAnsi="Arial" w:cs="Arial"/>
-        </w:rPr>
-        <w:t>Version</w:t>
-      </w:r>
-      <w:proofErr w:type="spellEnd"/>
-      <w:r>
-        <w:rPr>
-          <w:rFonts w:ascii="Arial" w:hAnsi="Arial" w:cs="Arial"/>
-        </w:rPr>
         <w:t xml:space="preserve"> 2.5.1. Disponível em: https://www.omg.org/spec/UML/2.5.1</w:t>
-      </w:r>
-    </w:p>
-    <w:p>
-      <w:pPr>
-        <w:pStyle w:val="NormalWeb"/>
-        <w:rPr>
-          <w:rFonts w:ascii="Arial" w:hAnsi="Arial" w:cs="Arial"/>
-        </w:rPr>
-      </w:pPr>
-      <w:proofErr w:type="spellStart"/>
-      <w:r>
-        <w:rPr>
-          <w:rFonts w:ascii="Arial" w:hAnsi="Arial" w:cs="Arial"/>
-        </w:rPr>
-        <w:t>Ambler</w:t>
-      </w:r>
-      <w:proofErr w:type="spellEnd"/>
-      <w:r>
-        <w:rPr>
-          <w:rFonts w:ascii="Arial" w:hAnsi="Arial" w:cs="Arial"/>
-        </w:rPr>
-        <w:t xml:space="preserve">, S. W. (2005). The </w:t>
-      </w:r>
-      <w:proofErr w:type="spellStart"/>
-      <w:r>
-        <w:rPr>
-          <w:rFonts w:ascii="Arial" w:hAnsi="Arial" w:cs="Arial"/>
-        </w:rPr>
-        <w:t>Object</w:t>
-      </w:r>
-      <w:proofErr w:type="spellEnd"/>
-      <w:r>
-        <w:rPr>
-          <w:rFonts w:ascii="Arial" w:hAnsi="Arial" w:cs="Arial"/>
-        </w:rPr>
-        <w:t xml:space="preserve"> Primer: </w:t>
-      </w:r>
-      <w:proofErr w:type="spellStart"/>
-      <w:r>
-        <w:rPr>
-          <w:rFonts w:ascii="Arial" w:hAnsi="Arial" w:cs="Arial"/>
-        </w:rPr>
-        <w:t>Agile</w:t>
-      </w:r>
-      <w:proofErr w:type="spellEnd"/>
-      <w:r>
-        <w:rPr>
-          <w:rFonts w:ascii="Arial" w:hAnsi="Arial" w:cs="Arial"/>
-        </w:rPr>
-        <w:t xml:space="preserve"> Model-</w:t>
-      </w:r>
-      <w:proofErr w:type="spellStart"/>
-      <w:r>
-        <w:rPr>
-          <w:rFonts w:ascii="Arial" w:hAnsi="Arial" w:cs="Arial"/>
-        </w:rPr>
-        <w:t>Driven</w:t>
-      </w:r>
-      <w:proofErr w:type="spellEnd"/>
-      <w:r>
-        <w:rPr>
-          <w:rFonts w:ascii="Arial" w:hAnsi="Arial" w:cs="Arial"/>
-        </w:rPr>
-        <w:t xml:space="preserve"> </w:t>
-      </w:r>
-      <w:proofErr w:type="spellStart"/>
-      <w:r>
-        <w:rPr>
-          <w:rFonts w:ascii="Arial" w:hAnsi="Arial" w:cs="Arial"/>
-        </w:rPr>
-        <w:t>Development</w:t>
-      </w:r>
-      <w:proofErr w:type="spellEnd"/>
-      <w:r>
-        <w:rPr>
-          <w:rFonts w:ascii="Arial" w:hAnsi="Arial" w:cs="Arial"/>
-        </w:rPr>
-        <w:t xml:space="preserve"> </w:t>
-      </w:r>
-      <w:proofErr w:type="spellStart"/>
-      <w:r>
-        <w:rPr>
-          <w:rFonts w:ascii="Arial" w:hAnsi="Arial" w:cs="Arial"/>
-        </w:rPr>
-        <w:t>with</w:t>
-      </w:r>
-      <w:proofErr w:type="spellEnd"/>
-      <w:r>
-        <w:rPr>
-          <w:rFonts w:ascii="Arial" w:hAnsi="Arial" w:cs="Arial"/>
-        </w:rPr>
-        <w:t xml:space="preserve"> UML 2.0. Cambridge </w:t>
-      </w:r>
-      <w:proofErr w:type="spellStart"/>
-      <w:r>
-        <w:rPr>
-          <w:rFonts w:ascii="Arial" w:hAnsi="Arial" w:cs="Arial"/>
-        </w:rPr>
-        <w:t>University</w:t>
-      </w:r>
-      <w:proofErr w:type="spellEnd"/>
-      <w:r>
-        <w:rPr>
-          <w:rFonts w:ascii="Arial" w:hAnsi="Arial" w:cs="Arial"/>
-        </w:rPr>
-        <w:t xml:space="preserve"> Press.</w:t>
       </w:r>
     </w:p>
     <w:p>

</xml_diff>